<commit_message>
modified:   doc/CV_Radko_Y_IT_spec_EN.docx 	modified:   doc/CV_Radko_Y_IT_spec_RU.docx
</commit_message>
<xml_diff>
--- a/doc/CV_Radko_Y_IT_spec_EN.docx
+++ b/doc/CV_Radko_Y_IT_spec_EN.docx
@@ -52,20 +52,12 @@
       </w:r>
       <w:r>
         <w:rPr>
-          <w:rFonts w:ascii="Calibri" w:cs="Calibri" w:eastAsia="Calibri" w:hAnsi="Calibri"/>
           <w:b w:val="1"/>
-          <w:i w:val="0"/>
-          <w:smallCaps w:val="0"/>
-          <w:strike w:val="0"/>
-          <w:color w:val="000000"/>
           <w:sz w:val="32"/>
           <w:szCs w:val="32"/>
-          <w:u w:val="none"/>
-          <w:shd w:fill="auto" w:val="clear"/>
-          <w:vertAlign w:val="baseline"/>
-          <w:rtl w:val="0"/>
-        </w:rPr>
-        <w:t xml:space="preserve">Summary</w:t>
+          <w:rtl w:val="0"/>
+        </w:rPr>
+        <w:t xml:space="preserve">CV</w:t>
       </w:r>
       <w:r>
         <w:rPr>
@@ -531,7 +523,20 @@
           <w:vertAlign w:val="baseline"/>
           <w:rtl w:val="0"/>
         </w:rPr>
-        <w:t xml:space="preserve">Phone: +38 (095) 468-24-88</w:t>
+        <w:t xml:space="preserve">Phone: +38 (095) </w:t>
+      </w:r>
+      <w:r>
+        <w:rPr>
+          <w:sz w:val="24"/>
+          <w:szCs w:val="24"/>
+          <w:rtl w:val="0"/>
+        </w:rPr>
+        <w:t xml:space="preserve">507-41-91</w:t>
+      </w:r>
+      <w:r>
+        <w:rPr>
+          <w:rtl w:val="0"/>
+        </w:rPr>
       </w:r>
     </w:p>
     <w:p>

</xml_diff>